<commit_message>
v1.1.0: tracker (status/notes/hide), live listings, fit score, map, resume variants
- Per-card status pipeline, private notes, hide/dismiss — synced via JSONBin
- Live listings from Greenhouse boards (Datadog/GitLab/Asana/Samsara/Klaviyo)
- Resume-based fit score + Best-fit sort
- Filter count badges, My-status filter, Hidden toggle, density toggle, tab-refocus pull, expiry flags
- Map tab (Leaflet/OSM) of CT opportunities near Guilford
- 4 tailored resume variants + print-to-PDF + per-card outreach generator

Co-Authored-By: Claude Opus 4.8 <noreply@anthropic.com>
</commit_message>
<xml_diff>
--- a/assets/resume/John-L-Evans-Resume-2026.docx
+++ b/assets/resume/John-L-Evans-Resume-2026.docx
@@ -27,7 +27,7 @@
           <w:sz w:val="21"/>
           <w:szCs w:val="21"/>
         </w:rPr>
-        <w:t xml:space="preserve">Staff Product Owner  ·  SAFe  ·  Learning &amp; Enablement  ·  Technical Communication</w:t>
+        <w:t xml:space="preserve">Staff Product Owner · SAFe · Learning &amp; Enablement · Technical Communication</w:t>
       </w:r>
     </w:p>
     <w:p>
@@ -53,7 +53,7 @@
         </w:rPr>
         <w:t xml:space="preserve">   |   </w:t>
       </w:r>
-      <w:hyperlink w:history="1" r:id="rIdgwsrqblikd_m3otprtlwf">
+      <w:hyperlink w:history="1" r:id="rIdpj2vre_nrixyj57aqhk88">
         <w:r>
           <w:rPr>
             <w:rStyle w:val="Hyperlink"/>

</xml_diff>